<commit_message>
Lesson 17: add section on building behind a VPN (prebuilt variant)
Co-Authored-By: Claude Opus 5.5 <noreply@anthropic.com>
</commit_message>
<xml_diff>
--- a/Documents/Lesson 17 - Docker - Packaging the App with Its Database.docx
+++ b/Documents/Lesson 17 - Docker - Packaging the App with Its Database.docx
@@ -43,17 +43,17 @@
         <w:t xml:space="preserve">Status:</w:t>
       </w:r>
       <w:r>
-        <w:t xml:space="preserve"> Files written and the app checked in container-like mode locally (branch </w:t>
-      </w:r>
-      <w:r>
-        <w:rPr>
-          <w:rFonts w:ascii="Consolas" w:cs="Consolas" w:eastAsia="Consolas" w:hAnsi="Consolas"/>
-          <w:color w:val="C7254E"/>
-        </w:rPr>
-        <w:t xml:space="preserve">feature/docker</w:t>
-      </w:r>
-      <w:r>
-        <w:t xml:space="preserve">). The image itself is built and tested by CI.</w:t>
+        <w:t xml:space="preserve"> Merged (PR #12); the </w:t>
+      </w:r>
+      <w:r>
+        <w:rPr>
+          <w:rFonts w:ascii="Consolas" w:cs="Consolas" w:eastAsia="Consolas" w:hAnsi="Consolas"/>
+          <w:color w:val="C7254E"/>
+        </w:rPr>
+        <w:t xml:space="preserve">docker</w:t>
+      </w:r>
+      <w:r>
+        <w:t xml:space="preserve"> CI job passed on master. Section 8 adds a second way to build, for networks where containers cannot reach NuGet.</w:t>
       </w:r>
     </w:p>
     <w:p>
@@ -3393,7 +3393,66 @@
         <w:pStyle w:val="Heading2"/>
       </w:pPr>
       <w:r>
-        <w:t xml:space="preserve">Key takeaways</w:t>
+        <w:t xml:space="preserve">8. When the build cannot reach NuGet: a real-world problem</w:t>
+      </w:r>
+    </w:p>
+    <w:p>
+      <w:r>
+        <w:t xml:space="preserve">On the office PC (Docker Desktop on Windows), </w:t>
+      </w:r>
+      <w:r>
+        <w:rPr>
+          <w:rFonts w:ascii="Consolas" w:cs="Consolas" w:eastAsia="Consolas" w:hAnsi="Consolas"/>
+          <w:color w:val="C7254E"/>
+        </w:rPr>
+        <w:t xml:space="preserve">docker compose up --build</w:t>
+      </w:r>
+      <w:r>
+        <w:t xml:space="preserve"> failed after more than an hour:</w:t>
+      </w:r>
+    </w:p>
+    <w:p>
+      <w:pPr>
+        <w:pBdr>
+          <w:left w:val="single" w:color="9CA3AF" w:sz="12" w:space="8"/>
+        </w:pBdr>
+        <w:shd w:fill="F3F4F6" w:color="auto" w:val="clear"/>
+        <w:spacing w:after="0" w:before="120" w:line="260"/>
+        <w:ind w:left="200"/>
+      </w:pPr>
+      <w:r>
+        <w:rPr>
+          <w:rFonts w:ascii="Consolas" w:cs="Consolas" w:eastAsia="Consolas" w:hAnsi="Consolas"/>
+          <w:sz w:val="19"/>
+          <w:szCs w:val="19"/>
+        </w:rPr>
+        <w:t xml:space="preserve">error NU1301: Unable to load the service index for source https://api.nuget.org/v3/index.json.</w:t>
+      </w:r>
+    </w:p>
+    <w:p>
+      <w:pPr>
+        <w:pBdr>
+          <w:left w:val="single" w:color="9CA3AF" w:sz="12" w:space="8"/>
+        </w:pBdr>
+        <w:shd w:fill="F3F4F6" w:color="auto" w:val="clear"/>
+        <w:spacing w:after="160" w:before="0" w:line="260"/>
+        <w:ind w:left="200"/>
+      </w:pPr>
+      <w:r>
+        <w:rPr>
+          <w:rFonts w:ascii="Consolas" w:cs="Consolas" w:eastAsia="Consolas" w:hAnsi="Consolas"/>
+          <w:sz w:val="19"/>
+          <w:szCs w:val="19"/>
+        </w:rPr>
+        <w:t xml:space="preserve">The HTTP request to 'GET https://api.nuget.org/v3/index.json' has timed out after 100000ms.</w:t>
+      </w:r>
+    </w:p>
+    <w:p>
+      <w:pPr>
+        <w:pStyle w:val="Heading3"/>
+      </w:pPr>
+      <w:r>
+        <w:t xml:space="preserve">Diagnosis</w:t>
       </w:r>
     </w:p>
     <w:p>
@@ -3405,7 +3464,17 @@
         </w:numPr>
       </w:pPr>
       <w:r>
-        <w:t xml:space="preserve">An image is the template, a container a running copy, and a volume the data that must survive.</w:t>
+        <w:t xml:space="preserve">Docker </w:t>
+      </w:r>
+      <w:r>
+        <w:rPr>
+          <w:b/>
+          <w:bCs/>
+        </w:rPr>
+        <w:t xml:space="preserve">could</w:t>
+      </w:r>
+      <w:r>
+        <w:t xml:space="preserve"> download the .NET images from Microsoft's registry, so it had some internet access.</w:t>
       </w:r>
     </w:p>
     <w:p>
@@ -3417,7 +3486,17 @@
         </w:numPr>
       </w:pPr>
       <w:r>
-        <w:t xml:space="preserve">Multi-stage builds: compile with the SDK, run on the small runtime image.</w:t>
+        <w:t xml:space="preserve">Inside the build, every HTTPS request to NuGet </w:t>
+      </w:r>
+      <w:r>
+        <w:rPr>
+          <w:b/>
+          <w:bCs/>
+        </w:rPr>
+        <w:t xml:space="preserve">timed out</w:t>
+      </w:r>
+      <w:r>
+        <w:t xml:space="preserve">: not refused, not "unknown host".</w:t>
       </w:r>
     </w:p>
     <w:p>
@@ -3429,7 +3508,17 @@
         </w:numPr>
       </w:pPr>
       <w:r>
-        <w:t xml:space="preserve">Order Dockerfile steps for caching: project files and restore first, source code later.</w:t>
+        <w:t xml:space="preserve">The office VPN runs </w:t>
+      </w:r>
+      <w:r>
+        <w:rPr>
+          <w:b/>
+          <w:bCs/>
+        </w:rPr>
+        <w:t xml:space="preserve">on the router</w:t>
+      </w:r>
+      <w:r>
+        <w:t xml:space="preserve">. All devices, including Docker, already go through it, so there is nothing to "bridge".</w:t>
       </w:r>
     </w:p>
     <w:p>
@@ -3441,7 +3530,326 @@
         </w:numPr>
       </w:pPr>
       <w:r>
-        <w:t xml:space="preserve">Run as non-root, on port 8080.</w:t>
+        <w:t xml:space="preserve">Setting Docker's DNS servers (</w:t>
+      </w:r>
+      <w:r>
+        <w:rPr>
+          <w:rFonts w:ascii="Consolas" w:cs="Consolas" w:eastAsia="Consolas" w:hAnsi="Consolas"/>
+          <w:color w:val="C7254E"/>
+        </w:rPr>
+        <w:t xml:space="preserve">"dns": ["8.8.8.8", "4.2.2.4"]</w:t>
+      </w:r>
+      <w:r>
+        <w:t xml:space="preserve"> in Settings, then Docker Engine) did </w:t>
+      </w:r>
+      <w:r>
+        <w:rPr>
+          <w:b/>
+          <w:bCs/>
+        </w:rPr>
+        <w:t xml:space="preserve">not</w:t>
+      </w:r>
+      <w:r>
+        <w:t xml:space="preserve"> help, so DNS was not the cause.</w:t>
+      </w:r>
+    </w:p>
+    <w:p>
+      <w:r>
+        <w:t xml:space="preserve">The usual remaining cause with VPN tunnels is the </w:t>
+      </w:r>
+      <w:r>
+        <w:rPr>
+          <w:b/>
+          <w:bCs/>
+        </w:rPr>
+        <w:t xml:space="preserve">MTU (maximum packet size)</w:t>
+      </w:r>
+      <w:r>
+        <w:t xml:space="preserve">. The tunnel adds its own data to every packet, so full-size 1500-byte packets no longer fit. Windows adapts automatically, but Docker's virtual network may not. Small packets pass, but the large packets at the start of an HTTPS connection (the server's certificate) are silently dropped, and the connection hangs until the timeout. A test such as </w:t>
+      </w:r>
+      <w:r>
+        <w:rPr>
+          <w:rFonts w:ascii="Consolas" w:cs="Consolas" w:eastAsia="Consolas" w:hAnsi="Consolas"/>
+          <w:color w:val="C7254E"/>
+        </w:rPr>
+        <w:t xml:space="preserve">ping -f -l 1472 8.8.8.8</w:t>
+      </w:r>
+      <w:r>
+        <w:t xml:space="preserve"> shows whether the path supports full-size packets.</w:t>
+      </w:r>
+    </w:p>
+    <w:p>
+      <w:pPr>
+        <w:pStyle w:val="Heading3"/>
+      </w:pPr>
+      <w:r>
+        <w:t xml:space="preserve">A solution that does not depend on Docker's network</w:t>
+      </w:r>
+    </w:p>
+    <w:p>
+      <w:r>
+        <w:t xml:space="preserve">The PC itself can reach NuGet (Visual Studio restores packages fine). So the app is </w:t>
+      </w:r>
+      <w:r>
+        <w:rPr>
+          <w:b/>
+          <w:bCs/>
+        </w:rPr>
+        <w:t xml:space="preserve">compiled on the PC</w:t>
+      </w:r>
+      <w:r>
+        <w:t xml:space="preserve">, and Docker only </w:t>
+      </w:r>
+      <w:r>
+        <w:rPr>
+          <w:b/>
+          <w:bCs/>
+        </w:rPr>
+        <w:t xml:space="preserve">packages</w:t>
+      </w:r>
+      <w:r>
+        <w:t xml:space="preserve"> the result:</w:t>
+      </w:r>
+    </w:p>
+    <w:p>
+      <w:pPr>
+        <w:pBdr>
+          <w:left w:val="single" w:color="9CA3AF" w:sz="12" w:space="8"/>
+        </w:pBdr>
+        <w:shd w:fill="F3F4F6" w:color="auto" w:val="clear"/>
+        <w:spacing w:after="0" w:before="120" w:line="260"/>
+        <w:ind w:left="200"/>
+      </w:pPr>
+      <w:r>
+        <w:rPr>
+          <w:rFonts w:ascii="Consolas" w:cs="Consolas" w:eastAsia="Consolas" w:hAnsi="Consolas"/>
+          <w:sz w:val="19"/>
+          <w:szCs w:val="19"/>
+        </w:rPr>
+        <w:t xml:space="preserve"># Dockerfile.prebuilt</w:t>
+      </w:r>
+    </w:p>
+    <w:p>
+      <w:pPr>
+        <w:pBdr>
+          <w:left w:val="single" w:color="9CA3AF" w:sz="12" w:space="8"/>
+        </w:pBdr>
+        <w:shd w:fill="F3F4F6" w:color="auto" w:val="clear"/>
+        <w:spacing w:after="0" w:before="0" w:line="260"/>
+        <w:ind w:left="200"/>
+      </w:pPr>
+      <w:r>
+        <w:rPr>
+          <w:rFonts w:ascii="Consolas" w:cs="Consolas" w:eastAsia="Consolas" w:hAnsi="Consolas"/>
+          <w:sz w:val="19"/>
+          <w:szCs w:val="19"/>
+        </w:rPr>
+        <w:t xml:space="preserve">FROM mcr.microsoft.com/dotnet/aspnet:10.0</w:t>
+      </w:r>
+    </w:p>
+    <w:p>
+      <w:pPr>
+        <w:pBdr>
+          <w:left w:val="single" w:color="9CA3AF" w:sz="12" w:space="8"/>
+        </w:pBdr>
+        <w:shd w:fill="F3F4F6" w:color="auto" w:val="clear"/>
+        <w:spacing w:after="0" w:before="0" w:line="260"/>
+        <w:ind w:left="200"/>
+      </w:pPr>
+      <w:r>
+        <w:rPr>
+          <w:rFonts w:ascii="Consolas" w:cs="Consolas" w:eastAsia="Consolas" w:hAnsi="Consolas"/>
+          <w:sz w:val="19"/>
+          <w:szCs w:val="19"/>
+        </w:rPr>
+        <w:t xml:space="preserve">WORKDIR /app</w:t>
+      </w:r>
+    </w:p>
+    <w:p>
+      <w:pPr>
+        <w:pBdr>
+          <w:left w:val="single" w:color="9CA3AF" w:sz="12" w:space="8"/>
+        </w:pBdr>
+        <w:shd w:fill="F3F4F6" w:color="auto" w:val="clear"/>
+        <w:spacing w:after="0" w:before="0" w:line="260"/>
+        <w:ind w:left="200"/>
+      </w:pPr>
+      <w:r>
+        <w:rPr>
+          <w:rFonts w:ascii="Consolas" w:cs="Consolas" w:eastAsia="Consolas" w:hAnsi="Consolas"/>
+          <w:sz w:val="19"/>
+          <w:szCs w:val="19"/>
+        </w:rPr>
+        <w:t xml:space="preserve">COPY publish/ .</w:t>
+      </w:r>
+    </w:p>
+    <w:p>
+      <w:pPr>
+        <w:pBdr>
+          <w:left w:val="single" w:color="9CA3AF" w:sz="12" w:space="8"/>
+        </w:pBdr>
+        <w:shd w:fill="F3F4F6" w:color="auto" w:val="clear"/>
+        <w:spacing w:after="160" w:before="0" w:line="260"/>
+        <w:ind w:left="200"/>
+      </w:pPr>
+      <w:r>
+        <w:rPr>
+          <w:rFonts w:ascii="Consolas" w:cs="Consolas" w:eastAsia="Consolas" w:hAnsi="Consolas"/>
+          <w:sz w:val="19"/>
+          <w:szCs w:val="19"/>
+        </w:rPr>
+        <w:t xml:space="preserve">... (same runtime setup as Dockerfile)</w:t>
+      </w:r>
+    </w:p>
+    <w:p>
+      <w:pPr>
+        <w:pBdr>
+          <w:left w:val="single" w:color="9CA3AF" w:sz="12" w:space="8"/>
+        </w:pBdr>
+        <w:shd w:fill="F3F4F6" w:color="auto" w:val="clear"/>
+        <w:spacing w:after="0" w:before="120" w:line="260"/>
+        <w:ind w:left="200"/>
+      </w:pPr>
+      <w:r>
+        <w:rPr>
+          <w:rFonts w:ascii="Consolas" w:cs="Consolas" w:eastAsia="Consolas" w:hAnsi="Consolas"/>
+          <w:sz w:val="19"/>
+          <w:szCs w:val="19"/>
+        </w:rPr>
+        <w:t xml:space="preserve"># docker-compose.prebuilt.yml: an override file</w:t>
+      </w:r>
+    </w:p>
+    <w:p>
+      <w:pPr>
+        <w:pBdr>
+          <w:left w:val="single" w:color="9CA3AF" w:sz="12" w:space="8"/>
+        </w:pBdr>
+        <w:shd w:fill="F3F4F6" w:color="auto" w:val="clear"/>
+        <w:spacing w:after="0" w:before="0" w:line="260"/>
+        <w:ind w:left="200"/>
+      </w:pPr>
+      <w:r>
+        <w:rPr>
+          <w:rFonts w:ascii="Consolas" w:cs="Consolas" w:eastAsia="Consolas" w:hAnsi="Consolas"/>
+          <w:sz w:val="19"/>
+          <w:szCs w:val="19"/>
+        </w:rPr>
+        <w:t xml:space="preserve">services:</w:t>
+      </w:r>
+    </w:p>
+    <w:p>
+      <w:pPr>
+        <w:pBdr>
+          <w:left w:val="single" w:color="9CA3AF" w:sz="12" w:space="8"/>
+        </w:pBdr>
+        <w:shd w:fill="F3F4F6" w:color="auto" w:val="clear"/>
+        <w:spacing w:after="0" w:before="0" w:line="260"/>
+        <w:ind w:left="200"/>
+      </w:pPr>
+      <w:r>
+        <w:rPr>
+          <w:rFonts w:ascii="Consolas" w:cs="Consolas" w:eastAsia="Consolas" w:hAnsi="Consolas"/>
+          <w:sz w:val="19"/>
+          <w:szCs w:val="19"/>
+        </w:rPr>
+        <w:t xml:space="preserve">  web:</w:t>
+      </w:r>
+    </w:p>
+    <w:p>
+      <w:pPr>
+        <w:pBdr>
+          <w:left w:val="single" w:color="9CA3AF" w:sz="12" w:space="8"/>
+        </w:pBdr>
+        <w:shd w:fill="F3F4F6" w:color="auto" w:val="clear"/>
+        <w:spacing w:after="0" w:before="0" w:line="260"/>
+        <w:ind w:left="200"/>
+      </w:pPr>
+      <w:r>
+        <w:rPr>
+          <w:rFonts w:ascii="Consolas" w:cs="Consolas" w:eastAsia="Consolas" w:hAnsi="Consolas"/>
+          <w:sz w:val="19"/>
+          <w:szCs w:val="19"/>
+        </w:rPr>
+        <w:t xml:space="preserve">    build:</w:t>
+      </w:r>
+    </w:p>
+    <w:p>
+      <w:pPr>
+        <w:pBdr>
+          <w:left w:val="single" w:color="9CA3AF" w:sz="12" w:space="8"/>
+        </w:pBdr>
+        <w:shd w:fill="F3F4F6" w:color="auto" w:val="clear"/>
+        <w:spacing w:after="0" w:before="0" w:line="260"/>
+        <w:ind w:left="200"/>
+      </w:pPr>
+      <w:r>
+        <w:rPr>
+          <w:rFonts w:ascii="Consolas" w:cs="Consolas" w:eastAsia="Consolas" w:hAnsi="Consolas"/>
+          <w:sz w:val="19"/>
+          <w:szCs w:val="19"/>
+        </w:rPr>
+        <w:t xml:space="preserve">      context: .</w:t>
+      </w:r>
+    </w:p>
+    <w:p>
+      <w:pPr>
+        <w:pBdr>
+          <w:left w:val="single" w:color="9CA3AF" w:sz="12" w:space="8"/>
+        </w:pBdr>
+        <w:shd w:fill="F3F4F6" w:color="auto" w:val="clear"/>
+        <w:spacing w:after="160" w:before="0" w:line="260"/>
+        <w:ind w:left="200"/>
+      </w:pPr>
+      <w:r>
+        <w:rPr>
+          <w:rFonts w:ascii="Consolas" w:cs="Consolas" w:eastAsia="Consolas" w:hAnsi="Consolas"/>
+          <w:sz w:val="19"/>
+          <w:szCs w:val="19"/>
+        </w:rPr>
+        <w:t xml:space="preserve">      dockerfile: Dockerfile.prebuilt</w:t>
+      </w:r>
+    </w:p>
+    <w:p>
+      <w:pPr>
+        <w:pBdr>
+          <w:left w:val="single" w:color="9CA3AF" w:sz="12" w:space="8"/>
+        </w:pBdr>
+        <w:shd w:fill="F3F4F6" w:color="auto" w:val="clear"/>
+        <w:spacing w:after="160" w:before="120" w:line="260"/>
+        <w:ind w:left="200"/>
+      </w:pPr>
+      <w:r>
+        <w:rPr>
+          <w:rFonts w:ascii="Consolas" w:cs="Consolas" w:eastAsia="Consolas" w:hAnsi="Consolas"/>
+          <w:sz w:val="19"/>
+          <w:szCs w:val="19"/>
+        </w:rPr>
+        <w:t xml:space="preserve">scripts\docker-prebuilt.cmd</w:t>
+      </w:r>
+    </w:p>
+    <w:p>
+      <w:r>
+        <w:t xml:space="preserve">The script runs </w:t>
+      </w:r>
+      <w:r>
+        <w:rPr>
+          <w:rFonts w:ascii="Consolas" w:cs="Consolas" w:eastAsia="Consolas" w:hAnsi="Consolas"/>
+          <w:color w:val="C7254E"/>
+        </w:rPr>
+        <w:t xml:space="preserve">dotnet publish ... --output publish</w:t>
+      </w:r>
+      <w:r>
+        <w:t xml:space="preserve">, then </w:t>
+      </w:r>
+      <w:r>
+        <w:rPr>
+          <w:rFonts w:ascii="Consolas" w:cs="Consolas" w:eastAsia="Consolas" w:hAnsi="Consolas"/>
+          <w:color w:val="C7254E"/>
+        </w:rPr>
+        <w:t xml:space="preserve">docker compose -f docker-compose.yml -f docker-compose.prebuilt.yml up --build</w:t>
+      </w:r>
+      <w:r>
+        <w:t xml:space="preserve">.</w:t>
       </w:r>
     </w:p>
     <w:p>
@@ -3453,17 +3861,54 @@
         </w:numPr>
       </w:pPr>
       <w:r>
-        <w:t xml:space="preserve">Secrets go into </w:t>
-      </w:r>
-      <w:r>
-        <w:rPr>
-          <w:rFonts w:ascii="Consolas" w:cs="Consolas" w:eastAsia="Consolas" w:hAnsi="Consolas"/>
-          <w:color w:val="C7254E"/>
-        </w:rPr>
-        <w:t xml:space="preserve">.env</w:t>
-      </w:r>
-      <w:r>
-        <w:t xml:space="preserve"> (git- and docker-ignored), and from there into environment variables.</w:t>
+        <w:rPr>
+          <w:b/>
+          <w:bCs/>
+        </w:rPr>
+        <w:t xml:space="preserve">Compose override files:</w:t>
+      </w:r>
+      <w:r>
+        <w:t xml:space="preserve"> with several </w:t>
+      </w:r>
+      <w:r>
+        <w:rPr>
+          <w:rFonts w:ascii="Consolas" w:cs="Consolas" w:eastAsia="Consolas" w:hAnsi="Consolas"/>
+          <w:color w:val="C7254E"/>
+        </w:rPr>
+        <w:t xml:space="preserve">-f</w:t>
+      </w:r>
+      <w:r>
+        <w:t xml:space="preserve"> files, Compose </w:t>
+      </w:r>
+      <w:r>
+        <w:rPr>
+          <w:b/>
+          <w:bCs/>
+        </w:rPr>
+        <w:t xml:space="preserve">merges</w:t>
+      </w:r>
+      <w:r>
+        <w:t xml:space="preserve"> them. The override only changes how </w:t>
+      </w:r>
+      <w:r>
+        <w:rPr>
+          <w:rFonts w:ascii="Consolas" w:cs="Consolas" w:eastAsia="Consolas" w:hAnsi="Consolas"/>
+          <w:color w:val="C7254E"/>
+        </w:rPr>
+        <w:t xml:space="preserve">web</w:t>
+      </w:r>
+      <w:r>
+        <w:t xml:space="preserve"> is built; the database, settings and volumes come from </w:t>
+      </w:r>
+      <w:r>
+        <w:rPr>
+          <w:rFonts w:ascii="Consolas" w:cs="Consolas" w:eastAsia="Consolas" w:hAnsi="Consolas"/>
+          <w:color w:val="C7254E"/>
+        </w:rPr>
+        <w:t xml:space="preserve">docker-compose.yml</w:t>
+      </w:r>
+      <w:r>
+        <w:t xml:space="preserve">.</w:t>
       </w:r>
     </w:p>
     <w:p>
@@ -3475,7 +3920,27 @@
         </w:numPr>
       </w:pPr>
       <w:r>
-        <w:t xml:space="preserve">Persist data protection keys, otherwise every restart logs everyone out.</w:t>
+        <w:t xml:space="preserve">A framework-dependent </w:t>
+      </w:r>
+      <w:r>
+        <w:rPr>
+          <w:rFonts w:ascii="Consolas" w:cs="Consolas" w:eastAsia="Consolas" w:hAnsi="Consolas"/>
+          <w:color w:val="C7254E"/>
+        </w:rPr>
+        <w:t xml:space="preserve">dotnet publish</w:t>
+      </w:r>
+      <w:r>
+        <w:t xml:space="preserve"> output is </w:t>
+      </w:r>
+      <w:r>
+        <w:rPr>
+          <w:b/>
+          <w:bCs/>
+        </w:rPr>
+        <w:t xml:space="preserve">cross-platform</w:t>
+      </w:r>
+      <w:r>
+        <w:t xml:space="preserve">: compiled on Windows, it runs in the Linux container, because .NET assemblies are platform-neutral and packages bring native files for all platforms.</w:t>
       </w:r>
     </w:p>
     <w:p>
@@ -3487,7 +3952,17 @@
         </w:numPr>
       </w:pPr>
       <w:r>
-        <w:t xml:space="preserve">Add a health check that includes the database.</w:t>
+        <w:t xml:space="preserve">The trade-off: the build is no longer self-contained (it needs the .NET SDK on the host), so the main </w:t>
+      </w:r>
+      <w:r>
+        <w:rPr>
+          <w:rFonts w:ascii="Consolas" w:cs="Consolas" w:eastAsia="Consolas" w:hAnsi="Consolas"/>
+          <w:color w:val="C7254E"/>
+        </w:rPr>
+        <w:t xml:space="preserve">Dockerfile</w:t>
+      </w:r>
+      <w:r>
+        <w:t xml:space="preserve"> stays the normal way. Many companies with restricted networks build images like this, or use an internal NuGet mirror.</w:t>
       </w:r>
     </w:p>
     <w:p>
@@ -3499,7 +3974,254 @@
         </w:numPr>
       </w:pPr>
       <w:r>
+        <w:t xml:space="preserve">A third CI job, </w:t>
+      </w:r>
+      <w:r>
+        <w:rPr>
+          <w:rFonts w:ascii="Consolas" w:cs="Consolas" w:eastAsia="Consolas" w:hAnsi="Consolas"/>
+          <w:color w:val="C7254E"/>
+        </w:rPr>
+        <w:t xml:space="preserve">docker-prebuilt</w:t>
+      </w:r>
+      <w:r>
+        <w:t xml:space="preserve">, tests this path on every pull request too.</w:t>
+      </w:r>
+    </w:p>
+    <w:p>
+      <w:pPr>
+        <w:pStyle w:val="Heading3"/>
+      </w:pPr>
+      <w:r>
+        <w:t xml:space="preserve">Line endings, a Windows detail</w:t>
+      </w:r>
+    </w:p>
+    <w:p>
+      <w:r>
+        <w:t xml:space="preserve">Git on Windows (</w:t>
+      </w:r>
+      <w:r>
+        <w:rPr>
+          <w:rFonts w:ascii="Consolas" w:cs="Consolas" w:eastAsia="Consolas" w:hAnsi="Consolas"/>
+          <w:color w:val="C7254E"/>
+        </w:rPr>
+        <w:t xml:space="preserve">core.autocrlf=true</w:t>
+      </w:r>
+      <w:r>
+        <w:t xml:space="preserve">) checks text files out with CRLF line endings. In Linux containers a CRLF breaks </w:t>
+      </w:r>
+      <w:r>
+        <w:rPr>
+          <w:rFonts w:ascii="Consolas" w:cs="Consolas" w:eastAsia="Consolas" w:hAnsi="Consolas"/>
+          <w:color w:val="C7254E"/>
+        </w:rPr>
+        <w:t xml:space="preserve">\</w:t>
+      </w:r>
+      <w:r>
+        <w:t xml:space="preserve"> line continuations, and in </w:t>
+      </w:r>
+      <w:r>
+        <w:rPr>
+          <w:rFonts w:ascii="Consolas" w:cs="Consolas" w:eastAsia="Consolas" w:hAnsi="Consolas"/>
+          <w:color w:val="C7254E"/>
+        </w:rPr>
+        <w:t xml:space="preserve">.env</w:t>
+      </w:r>
+      <w:r>
+        <w:t xml:space="preserve"> it would add an invisible carriage return to every password. </w:t>
+      </w:r>
+      <w:r>
+        <w:rPr>
+          <w:rFonts w:ascii="Consolas" w:cs="Consolas" w:eastAsia="Consolas" w:hAnsi="Consolas"/>
+          <w:color w:val="C7254E"/>
+        </w:rPr>
+        <w:t xml:space="preserve">.gitattributes</w:t>
+      </w:r>
+      <w:r>
+        <w:t xml:space="preserve"> therefore forces LF for </w:t>
+      </w:r>
+      <w:r>
+        <w:rPr>
+          <w:rFonts w:ascii="Consolas" w:cs="Consolas" w:eastAsia="Consolas" w:hAnsi="Consolas"/>
+          <w:color w:val="C7254E"/>
+        </w:rPr>
+        <w:t xml:space="preserve">Dockerfile*</w:t>
+      </w:r>
+      <w:r>
+        <w:t xml:space="preserve">, </w:t>
+      </w:r>
+      <w:r>
+        <w:rPr>
+          <w:rFonts w:ascii="Consolas" w:cs="Consolas" w:eastAsia="Consolas" w:hAnsi="Consolas"/>
+          <w:color w:val="C7254E"/>
+        </w:rPr>
+        <w:t xml:space="preserve">*.yml</w:t>
+      </w:r>
+      <w:r>
+        <w:t xml:space="preserve">, </w:t>
+      </w:r>
+      <w:r>
+        <w:rPr>
+          <w:rFonts w:ascii="Consolas" w:cs="Consolas" w:eastAsia="Consolas" w:hAnsi="Consolas"/>
+          <w:color w:val="C7254E"/>
+        </w:rPr>
+        <w:t xml:space="preserve">.dockerignore</w:t>
+      </w:r>
+      <w:r>
+        <w:t xml:space="preserve"> and </w:t>
+      </w:r>
+      <w:r>
+        <w:rPr>
+          <w:rFonts w:ascii="Consolas" w:cs="Consolas" w:eastAsia="Consolas" w:hAnsi="Consolas"/>
+          <w:color w:val="C7254E"/>
+        </w:rPr>
+        <w:t xml:space="preserve">.env.example</w:t>
+      </w:r>
+      <w:r>
+        <w:t xml:space="preserve">, and CRLF for </w:t>
+      </w:r>
+      <w:r>
+        <w:rPr>
+          <w:rFonts w:ascii="Consolas" w:cs="Consolas" w:eastAsia="Consolas" w:hAnsi="Consolas"/>
+          <w:color w:val="C7254E"/>
+        </w:rPr>
+        <w:t xml:space="preserve">*.cmd</w:t>
+      </w:r>
+      <w:r>
+        <w:t xml:space="preserve"> (batch files need Windows line endings).</w:t>
+      </w:r>
+    </w:p>
+    <w:p>
+      <w:pPr>
+        <w:pBdr>
+          <w:bottom w:val="single" w:color="BFBFBF" w:sz="6" w:space="1"/>
+        </w:pBdr>
+        <w:spacing w:after="200"/>
+      </w:pPr>
+    </w:p>
+    <w:p>
+      <w:pPr>
+        <w:pStyle w:val="Heading2"/>
+      </w:pPr>
+      <w:r>
+        <w:t xml:space="preserve">Key takeaways</w:t>
+      </w:r>
+    </w:p>
+    <w:p>
+      <w:pPr>
+        <w:pStyle w:val="ListParagraph"/>
+        <w:numPr>
+          <w:ilvl w:val="0"/>
+          <w:numId w:val="2"/>
+        </w:numPr>
+      </w:pPr>
+      <w:r>
+        <w:t xml:space="preserve">An image is the template, a container a running copy, and a volume the data that must survive.</w:t>
+      </w:r>
+    </w:p>
+    <w:p>
+      <w:pPr>
+        <w:pStyle w:val="ListParagraph"/>
+        <w:numPr>
+          <w:ilvl w:val="0"/>
+          <w:numId w:val="2"/>
+        </w:numPr>
+      </w:pPr>
+      <w:r>
+        <w:t xml:space="preserve">Multi-stage builds: compile with the SDK, run on the small runtime image.</w:t>
+      </w:r>
+    </w:p>
+    <w:p>
+      <w:pPr>
+        <w:pStyle w:val="ListParagraph"/>
+        <w:numPr>
+          <w:ilvl w:val="0"/>
+          <w:numId w:val="2"/>
+        </w:numPr>
+      </w:pPr>
+      <w:r>
+        <w:t xml:space="preserve">Order Dockerfile steps for caching: project files and restore first, source code later.</w:t>
+      </w:r>
+    </w:p>
+    <w:p>
+      <w:pPr>
+        <w:pStyle w:val="ListParagraph"/>
+        <w:numPr>
+          <w:ilvl w:val="0"/>
+          <w:numId w:val="2"/>
+        </w:numPr>
+      </w:pPr>
+      <w:r>
+        <w:t xml:space="preserve">Run as non-root, on port 8080.</w:t>
+      </w:r>
+    </w:p>
+    <w:p>
+      <w:pPr>
+        <w:pStyle w:val="ListParagraph"/>
+        <w:numPr>
+          <w:ilvl w:val="0"/>
+          <w:numId w:val="2"/>
+        </w:numPr>
+      </w:pPr>
+      <w:r>
+        <w:t xml:space="preserve">Secrets go into </w:t>
+      </w:r>
+      <w:r>
+        <w:rPr>
+          <w:rFonts w:ascii="Consolas" w:cs="Consolas" w:eastAsia="Consolas" w:hAnsi="Consolas"/>
+          <w:color w:val="C7254E"/>
+        </w:rPr>
+        <w:t xml:space="preserve">.env</w:t>
+      </w:r>
+      <w:r>
+        <w:t xml:space="preserve"> (git- and docker-ignored), and from there into environment variables.</w:t>
+      </w:r>
+    </w:p>
+    <w:p>
+      <w:pPr>
+        <w:pStyle w:val="ListParagraph"/>
+        <w:numPr>
+          <w:ilvl w:val="0"/>
+          <w:numId w:val="2"/>
+        </w:numPr>
+      </w:pPr>
+      <w:r>
+        <w:t xml:space="preserve">Persist data protection keys, otherwise every restart logs everyone out.</w:t>
+      </w:r>
+    </w:p>
+    <w:p>
+      <w:pPr>
+        <w:pStyle w:val="ListParagraph"/>
+        <w:numPr>
+          <w:ilvl w:val="0"/>
+          <w:numId w:val="2"/>
+        </w:numPr>
+      </w:pPr>
+      <w:r>
+        <w:t xml:space="preserve">Add a health check that includes the database.</w:t>
+      </w:r>
+    </w:p>
+    <w:p>
+      <w:pPr>
+        <w:pStyle w:val="ListParagraph"/>
+        <w:numPr>
+          <w:ilvl w:val="0"/>
+          <w:numId w:val="2"/>
+        </w:numPr>
+      </w:pPr>
+      <w:r>
         <w:t xml:space="preserve">If you cannot run Docker locally, let CI build and test the image.</w:t>
+      </w:r>
+    </w:p>
+    <w:p>
+      <w:pPr>
+        <w:pStyle w:val="ListParagraph"/>
+        <w:numPr>
+          <w:ilvl w:val="0"/>
+          <w:numId w:val="2"/>
+        </w:numPr>
+      </w:pPr>
+      <w:r>
+        <w:t xml:space="preserve">If containers cannot reach the internet (VPN, proxy, MTU), compile on the host and let Docker only package the result.</w:t>
       </w:r>
     </w:p>
     <w:p>
@@ -3592,6 +4314,18 @@
       </w:pPr>
       <w:r>
         <w:t xml:space="preserve">How do you keep secrets out of a Docker image?</w:t>
+      </w:r>
+    </w:p>
+    <w:p>
+      <w:pPr>
+        <w:pStyle w:val="ListParagraph"/>
+        <w:numPr>
+          <w:ilvl w:val="0"/>
+          <w:numId w:val="4"/>
+        </w:numPr>
+      </w:pPr>
+      <w:r>
+        <w:t xml:space="preserve">A Docker build times out downloading packages, but your PC can download them. What could cause it, and what would you do?</w:t>
       </w:r>
     </w:p>
     <w:sectPr>

</xml_diff>